<commit_message>
feat: add new semanario documents and QA artifacts for September 2026
</commit_message>
<xml_diff>
--- a/docs/semanarios/2026-09/semanario-ricardo-palhares-2026-09-28-a-10-02-semana-a.docx
+++ b/docs/semanarios/2026-09/semanario-ricardo-palhares-2026-09-28-a-10-02-semana-a.docx
@@ -2,7 +2,7 @@
 <file path=word/document.xml><?xml version="1.0" encoding="utf-8"?>
 <w:document xmlns:w="http://schemas.openxmlformats.org/wordprocessingml/2006/main" xmlns:m="http://schemas.openxmlformats.org/officeDocument/2006/math" xmlns:r="http://schemas.openxmlformats.org/officeDocument/2006/relationships" xmlns:o="urn:schemas-microsoft-com:office:office" xmlns:v="urn:schemas-microsoft-com:vml" xmlns:w10="urn:schemas-microsoft-com:office:word" xmlns:a="http://schemas.openxmlformats.org/drawingml/2006/main" xmlns:pic="http://schemas.openxmlformats.org/drawingml/2006/picture" xmlns:wp="http://schemas.openxmlformats.org/drawingml/2006/wordprocessingDrawing">
   <w:body>
-    <w:bookmarkStart w:id="15" w:name="Xae49965b2ad081a8d9faf176be2b21e61607651"/>
+    <w:bookmarkStart w:id="20" w:name="Xa4534a488004bbe74f5169369149fefc7a9ea8f"/>
     <w:p>
       <w:pPr>
         <w:pStyle w:val="Heading1"/>
@@ -18,13 +18,30 @@
       </w:pPr>
       <w:r>
         <w:t xml:space="preserve">Visão da semana</w:t>
+      </w:r>
+    </w:p>
+    <w:p>
+      <w:pPr>
+        <w:pStyle w:val="BlockText"/>
+      </w:pPr>
+      <w:r>
+        <w:rPr>
+          <w:b/>
+          <w:bCs/>
+        </w:rPr>
+        <w:t xml:space="preserve">Orientação temporária da retomada:</w:t>
+      </w:r>
+      <w:r>
+        <w:t xml:space="preserve"> </w:t>
+      </w:r>
+      <w:r>
+        <w:t xml:space="preserve">priorizar propostas com construção, montagem, experimentação e teste para recuperar o vínculo dos estudantes com a experiência prática nas aulas de Tecnologia. É uma prioridade desta fase, não uma regra curricular permanente.</w:t>
       </w:r>
     </w:p>
     <w:tbl>
       <w:tblPr>
         <w:tblStyle w:val="Table"/>
-        <w:tblW w:type="pct" w:w="5000"/>
-        <w:tblLayout w:type="fixed"/>
+        <w:tblW w:type="auto" w:w="0"/>
         <w:tblLook w:firstRow="1" w:lastRow="0" w:firstColumn="0" w:lastColumn="0" w:noHBand="0" w:noVBand="0" w:val="0020"/>
       </w:tblPr>
       <w:tblGrid>
@@ -125,7 +142,7 @@
               <w:pStyle w:val="Compact"/>
             </w:pPr>
             <w:r>
-              <w:t xml:space="preserve">30/09, 07:15–08:55</w:t>
+              <w:t xml:space="preserve">30/09, 07:1508:55</w:t>
             </w:r>
           </w:p>
         </w:tc>
@@ -158,18 +175,18 @@
               <w:pStyle w:val="Compact"/>
             </w:pPr>
             <w:r>
-              <w:t xml:space="preserve">p. 106</w:t>
-            </w:r>
-          </w:p>
-        </w:tc>
-        <w:tc>
-          <w:tcPr/>
-          <w:p>
-            <w:pPr>
-              <w:pStyle w:val="Compact"/>
-            </w:pPr>
-            <w:r>
-              <w:t xml:space="preserve">pp. 17–24</w:t>
+              <w:t xml:space="preserve">p. 106</w:t>
+            </w:r>
+          </w:p>
+        </w:tc>
+        <w:tc>
+          <w:tcPr/>
+          <w:p>
+            <w:pPr>
+              <w:pStyle w:val="Compact"/>
+            </w:pPr>
+            <w:r>
+              <w:t xml:space="preserve">pp. 17–24</w:t>
             </w:r>
           </w:p>
         </w:tc>
@@ -193,18 +210,7 @@
               <w:pStyle w:val="Compact"/>
             </w:pPr>
             <w:r>
-              <w:t xml:space="preserve">30/09, 14:35–15:45</w:t>
-            </w:r>
-          </w:p>
-        </w:tc>
-        <w:tc>
-          <w:tcPr/>
-          <w:p>
-            <w:pPr>
-              <w:pStyle w:val="Compact"/>
-            </w:pPr>
-            <w:r>
-              <w:t xml:space="preserve">Sistema respiratório</w:t>
+              <w:t xml:space="preserve">30/09, 14:3515:45</w:t>
             </w:r>
           </w:p>
         </w:tc>
@@ -226,18 +232,29 @@
               <w:pStyle w:val="Compact"/>
             </w:pPr>
             <w:r>
-              <w:t xml:space="preserve">p. 234</w:t>
-            </w:r>
-          </w:p>
-        </w:tc>
-        <w:tc>
-          <w:tcPr/>
-          <w:p>
-            <w:pPr>
-              <w:pStyle w:val="Compact"/>
-            </w:pPr>
-            <w:r>
-              <w:t xml:space="preserve">p. 195</w:t>
+              <w:t xml:space="preserve">Código Morse</w:t>
+            </w:r>
+          </w:p>
+        </w:tc>
+        <w:tc>
+          <w:tcPr/>
+          <w:p>
+            <w:pPr>
+              <w:pStyle w:val="Compact"/>
+            </w:pPr>
+            <w:r>
+              <w:t xml:space="preserve">p. 240</w:t>
+            </w:r>
+          </w:p>
+        </w:tc>
+        <w:tc>
+          <w:tcPr/>
+          <w:p>
+            <w:pPr>
+              <w:pStyle w:val="Compact"/>
+            </w:pPr>
+            <w:r>
+              <w:t xml:space="preserve">pp. 4–14</w:t>
             </w:r>
           </w:p>
         </w:tc>
@@ -261,7 +278,7 @@
               <w:pStyle w:val="Compact"/>
             </w:pPr>
             <w:r>
-              <w:t xml:space="preserve">30/09, 15:45–17:25</w:t>
+              <w:t xml:space="preserve">30/09, 15:4517:25</w:t>
             </w:r>
           </w:p>
         </w:tc>
@@ -294,18 +311,18 @@
               <w:pStyle w:val="Compact"/>
             </w:pPr>
             <w:r>
-              <w:t xml:space="preserve">p. 106</w:t>
-            </w:r>
-          </w:p>
-        </w:tc>
-        <w:tc>
-          <w:tcPr/>
-          <w:p>
-            <w:pPr>
-              <w:pStyle w:val="Compact"/>
-            </w:pPr>
-            <w:r>
-              <w:t xml:space="preserve">pp. 17–24</w:t>
+              <w:t xml:space="preserve">p. 106</w:t>
+            </w:r>
+          </w:p>
+        </w:tc>
+        <w:tc>
+          <w:tcPr/>
+          <w:p>
+            <w:pPr>
+              <w:pStyle w:val="Compact"/>
+            </w:pPr>
+            <w:r>
+              <w:t xml:space="preserve">pp. 17–24</w:t>
             </w:r>
           </w:p>
         </w:tc>
@@ -329,7 +346,7 @@
               <w:pStyle w:val="Compact"/>
             </w:pPr>
             <w:r>
-              <w:t xml:space="preserve">01/10, 07:15–08:55</w:t>
+              <w:t xml:space="preserve">01/10, 07:1508:55</w:t>
             </w:r>
           </w:p>
         </w:tc>
@@ -362,18 +379,18 @@
               <w:pStyle w:val="Compact"/>
             </w:pPr>
             <w:r>
-              <w:t xml:space="preserve">p. 234</w:t>
-            </w:r>
-          </w:p>
-        </w:tc>
-        <w:tc>
-          <w:tcPr/>
-          <w:p>
-            <w:pPr>
-              <w:pStyle w:val="Compact"/>
-            </w:pPr>
-            <w:r>
-              <w:t xml:space="preserve">p. 195</w:t>
+              <w:t xml:space="preserve">p. 234</w:t>
+            </w:r>
+          </w:p>
+        </w:tc>
+        <w:tc>
+          <w:tcPr/>
+          <w:p>
+            <w:pPr>
+              <w:pStyle w:val="Compact"/>
+            </w:pPr>
+            <w:r>
+              <w:t xml:space="preserve">p. 195</w:t>
             </w:r>
           </w:p>
         </w:tc>
@@ -397,7 +414,7 @@
               <w:pStyle w:val="Compact"/>
             </w:pPr>
             <w:r>
-              <w:t xml:space="preserve">01/10, 08:55–09:20 e 10:05–10:55</w:t>
+              <w:t xml:space="preserve">01/10, 08:5509:20 e 10:0510:55</w:t>
             </w:r>
           </w:p>
         </w:tc>
@@ -430,18 +447,18 @@
               <w:pStyle w:val="Compact"/>
             </w:pPr>
             <w:r>
-              <w:t xml:space="preserve">p. 106</w:t>
-            </w:r>
-          </w:p>
-        </w:tc>
-        <w:tc>
-          <w:tcPr/>
-          <w:p>
-            <w:pPr>
-              <w:pStyle w:val="Compact"/>
-            </w:pPr>
-            <w:r>
-              <w:t xml:space="preserve">pp. 17–24</w:t>
+              <w:t xml:space="preserve">p. 106</w:t>
+            </w:r>
+          </w:p>
+        </w:tc>
+        <w:tc>
+          <w:tcPr/>
+          <w:p>
+            <w:pPr>
+              <w:pStyle w:val="Compact"/>
+            </w:pPr>
+            <w:r>
+              <w:t xml:space="preserve">pp. 17–24</w:t>
             </w:r>
           </w:p>
         </w:tc>
@@ -465,7 +482,7 @@
               <w:pStyle w:val="Compact"/>
             </w:pPr>
             <w:r>
-              <w:t xml:space="preserve">01/10, 10:55–11:45</w:t>
+              <w:t xml:space="preserve">01/10, 10:5511:45</w:t>
             </w:r>
           </w:p>
         </w:tc>
@@ -498,18 +515,18 @@
               <w:pStyle w:val="Compact"/>
             </w:pPr>
             <w:r>
-              <w:t xml:space="preserve">p. 122</w:t>
-            </w:r>
-          </w:p>
-        </w:tc>
-        <w:tc>
-          <w:tcPr/>
-          <w:p>
-            <w:pPr>
-              <w:pStyle w:val="Compact"/>
-            </w:pPr>
-            <w:r>
-              <w:t xml:space="preserve">p. 97</w:t>
+              <w:t xml:space="preserve">p. 122</w:t>
+            </w:r>
+          </w:p>
+        </w:tc>
+        <w:tc>
+          <w:tcPr/>
+          <w:p>
+            <w:pPr>
+              <w:pStyle w:val="Compact"/>
+            </w:pPr>
+            <w:r>
+              <w:t xml:space="preserve">p. 97</w:t>
             </w:r>
           </w:p>
         </w:tc>
@@ -837,7 +854,7 @@
       </w:tr>
     </w:tbl>
     <w:bookmarkEnd w:id="10"/>
-    <w:bookmarkStart w:id="14" w:name="roteiros-compartilhados"/>
+    <w:bookmarkStart w:id="19" w:name="roteiros-compartilhados"/>
     <w:p>
       <w:pPr>
         <w:pStyle w:val="Heading2"/>
@@ -846,7 +863,7 @@
         <w:t xml:space="preserve">Roteiros compartilhados</w:t>
       </w:r>
     </w:p>
-    <w:bookmarkStart w:id="11" w:name="º-ano-máquina-de-desenhar"/>
+    <w:bookmarkStart w:id="12" w:name="X43898e0bbef972efd6da1e0d0cfb7375aaa3008"/>
     <w:p>
       <w:pPr>
         <w:pStyle w:val="Heading3"/>
@@ -876,7 +893,7 @@
         </w:numPr>
       </w:pPr>
       <w:r>
-        <w:t xml:space="preserve">Referências: professor p. 106; aluno pp. 17–24.</w:t>
+        <w:t xml:space="preserve">Referências: professor p. 106; aluno pp. 17–24.</w:t>
       </w:r>
     </w:p>
     <w:p>
@@ -894,14 +911,13 @@
     <w:tbl>
       <w:tblPr>
         <w:tblStyle w:val="Table"/>
-        <w:tblW w:type="pct" w:w="5000"/>
-        <w:tblLayout w:type="fixed"/>
+        <w:tblW w:type="auto" w:w="0"/>
         <w:tblLook w:firstRow="1" w:lastRow="0" w:firstColumn="0" w:lastColumn="0" w:noHBand="0" w:noVBand="0" w:val="0020"/>
       </w:tblPr>
       <w:tblGrid>
-        <w:gridCol w:w="2376"/>
-        <w:gridCol w:w="3168"/>
-        <w:gridCol w:w="2376"/>
+        <w:gridCol w:w="2640"/>
+        <w:gridCol w:w="2640"/>
+        <w:gridCol w:w="2640"/>
       </w:tblGrid>
       <w:tr>
         <w:trPr>
@@ -1087,22 +1103,36 @@
         </w:tc>
       </w:tr>
     </w:tbl>
+    <w:bookmarkStart w:id="11" w:name="resumo-do-encontro"/>
+    <w:p>
+      <w:pPr>
+        <w:pStyle w:val="Heading4"/>
+      </w:pPr>
+      <w:r>
+        <w:t xml:space="preserve">Resumo do Encontro</w:t>
+      </w:r>
+    </w:p>
+    <w:p>
+      <w:pPr>
+        <w:pStyle w:val="BlockText"/>
+      </w:pPr>
+      <w:r>
+        <w:rPr>
+          <w:b/>
+          <w:bCs/>
+        </w:rPr>
+        <w:t xml:space="preserve">Mensagem de rotina para as famílias:</w:t>
+      </w:r>
+      <w:r>
+        <w:t xml:space="preserve"> </w:t>
+      </w:r>
+      <w:r>
+        <w:t xml:space="preserve">Hoje a turma programou trajetos para criar desenhos com o Matata. As crianças imaginaram as formas, organizaram os comandos, observaram o resultado de cada tentativa e fizeram correções para aperfeiçoar a produção. A proposta trabalhou programação, orientação espacial e expressão criativa.</w:t>
+      </w:r>
+    </w:p>
     <w:bookmarkEnd w:id="11"/>
-    <w:bookmarkStart w:id="12" w:name="º-ano-máquina-gbc"/>
-    <w:p>
-      <w:pPr>
-        <w:pStyle w:val="Heading4"/>
-      </w:pPr>
-      <w:r>
-        <w:t>Resumo do Encontro</w:t>
-      </w:r>
-    </w:p>
-    <w:p>
-      <w:pPr/>
-      <w:r>
-        <w:t>Mensagem de rotina para as famílias: Hoje a turma programou trajetos para criar desenhos com o Matata. As crianças imaginaram as formas, organizaram os comandos, observaram o resultado de cada tentativa e fizeram correções para aperfeiçoar a produção. A proposta trabalhou programação, orientação espacial e expressão criativa.</w:t>
-      </w:r>
-    </w:p>
+    <w:bookmarkEnd w:id="12"/>
+    <w:bookmarkStart w:id="14" w:name="X24eec1fb50886555e1f8fba400bfb8571a3b2d5"/>
     <w:p>
       <w:pPr>
         <w:pStyle w:val="Heading3"/>
@@ -1120,7 +1150,7 @@
         </w:numPr>
       </w:pPr>
       <w:r>
-        <w:t xml:space="preserve">Objetivo: iniciar a construção de uma Máquina GBC e relacionar seus mecanismos ao transporte de objetos.</w:t>
+        <w:t xml:space="preserve">Objetivo: construir e testar uma Máquina GBC que sincroniza o movimento de uma bolinha com o repositor, relacionando o mecanismo ao transporte e à reposição de cargas nos portos.</w:t>
       </w:r>
     </w:p>
     <w:p>
@@ -1132,7 +1162,7 @@
         </w:numPr>
       </w:pPr>
       <w:r>
-        <w:t xml:space="preserve">Referências: professor p. 122; aluno p. 97.</w:t>
+        <w:t xml:space="preserve">Referências: Manual do Educador, p. 122; material do estudante, p. 97; roteiro de montagem correspondente.</w:t>
       </w:r>
     </w:p>
     <w:p>
@@ -1144,7 +1174,7 @@
         </w:numPr>
       </w:pPr>
       <w:r>
-        <w:t xml:space="preserve">Materiais: apostila, peças de montagem e objetos pequenos para teste.</w:t>
+        <w:t xml:space="preserve">Materiais: peças identificadas na montagem do manual — motor, engrenagens de 8, 24 e 40 dentes, excêntrica e vigas — além da rampa e da bolinha de gude que percorre o mecanismo.</w:t>
       </w:r>
     </w:p>
     <w:p>
@@ -1156,31 +1186,45 @@
         </w:numPr>
       </w:pPr>
       <w:r>
-        <w:t xml:space="preserve">Condução: retomada do desafio de medida; início da montagem; teste de um percurso; registro da função de uma peça. O encontro de 50 minutos do 4ºA inicia a mesma experiência do próximo ciclo B.</w:t>
-      </w:r>
-    </w:p>
-    <w:bookmarkEnd w:id="12"/>
-    <w:bookmarkStart w:id="13" w:name="º-ano-desafio-de-bem-estar"/>
+        <w:t xml:space="preserve">Condução: no bloco de 50 minutos do 4ºA, iniciar a montagem e testar o mecanismo até onde o tempo permitir; continuar a construção, os ajustes e a observação do ciclo no encontro seguinte, conforme a sequência semanal. O manual não informa duração aproximada para concluir a montagem.</w:t>
+      </w:r>
+    </w:p>
+    <w:bookmarkStart w:id="13" w:name="resumo-do-encontro-1"/>
     <w:p>
       <w:pPr>
         <w:pStyle w:val="Heading4"/>
       </w:pPr>
       <w:r>
-        <w:t>Resumo do Encontro</w:t>
-      </w:r>
-    </w:p>
-    <w:p>
-      <w:pPr/>
-      <w:r>
-        <w:t>Mensagem de rotina para as famílias: Hoje a turma iniciou a construção da Máquina GBC, um percurso que transporta pequenos objetos por meio de mecanismos. Em equipe, as crianças observaram as peças, levantaram hipóteses, testaram possibilidades de montagem e fizeram os primeiros ajustes. A atividade desenvolveu raciocínio lógico, criatividade e persistência diante dos desafios.</w:t>
-      </w:r>
-    </w:p>
+        <w:t xml:space="preserve">Resumo do Encontro</w:t>
+      </w:r>
+    </w:p>
+    <w:p>
+      <w:pPr>
+        <w:pStyle w:val="BlockText"/>
+      </w:pPr>
+      <w:r>
+        <w:rPr>
+          <w:b/>
+          <w:bCs/>
+        </w:rPr>
+        <w:t xml:space="preserve">Mensagem de rotina para as famílias:</w:t>
+      </w:r>
+      <w:r>
+        <w:t xml:space="preserve"> </w:t>
+      </w:r>
+      <w:r>
+        <w:t xml:space="preserve">A turma iniciou a construção da Máquina GBC, que sincroniza o percurso de uma bolinha com um mecanismo repositor. Em equipe, as crianças observaram as engrenagens e demais componentes, testaram a montagem e fizeram os primeiros ajustes, relacionando o funcionamento ao transporte de cargas nos portos.</w:t>
+      </w:r>
+    </w:p>
+    <w:bookmarkEnd w:id="13"/>
+    <w:bookmarkEnd w:id="14"/>
+    <w:bookmarkStart w:id="16" w:name="X75634441fafd7c3bf6bd75b23d701e30444fec3"/>
     <w:p>
       <w:pPr>
         <w:pStyle w:val="Heading3"/>
       </w:pPr>
       <w:r>
-        <w:t xml:space="preserve">5º ano — Desafio de Bem-estar</w:t>
+        <w:t xml:space="preserve">5ºB — Momento do Desafio: Bem-estar (01/10, 07:1508:55)</w:t>
       </w:r>
     </w:p>
     <w:p>
@@ -1192,7 +1236,7 @@
         </w:numPr>
       </w:pPr>
       <w:r>
-        <w:t xml:space="preserve">Objetivo: aplicar o estudo do Sistema respiratório em uma investigação de bem-estar.</w:t>
+        <w:t xml:space="preserve">Objetivo: planejar em equipe um cardápio equilibrado para uma semana e selecionar opções para a cantina, justificando as escolhas pelos critérios de variedade, moderação e equilíbrio apresentados no manual.</w:t>
       </w:r>
     </w:p>
     <w:p>
@@ -1204,7 +1248,7 @@
         </w:numPr>
       </w:pPr>
       <w:r>
-        <w:t xml:space="preserve">Referências: professor p. 234; aluno p. 195.</w:t>
+        <w:t xml:space="preserve">Referências: Manual do Educador, pp. 234–236; material do estudante, p. 195.</w:t>
       </w:r>
     </w:p>
     <w:p>
@@ -1216,20 +1260,68 @@
         </w:numPr>
       </w:pPr>
       <w:r>
-        <w:t xml:space="preserve">Materiais: apostila, registros do Sistema respiratório e material indicado no desafio.</w:t>
+        <w:t xml:space="preserve">Materiais: papel sulfite, lápis de cor, canetas hidrocor, giz de cera e materiais para desenho ou colagem disponíveis. Se possível, consultar o cardápio oficial da escola como exemplo, conforme a orientação do manual.</w:t>
+      </w:r>
+    </w:p>
+    <w:p>
+      <w:pPr>
+        <w:pStyle w:val="Compact"/>
+        <w:numPr>
+          <w:ilvl w:val="0"/>
+          <w:numId w:val="1003"/>
+        </w:numPr>
+      </w:pPr>
+      <w:r>
+        <w:t xml:space="preserve">Produto: cada equipe elabora uma parte do cardápio; a turma reúne as partes em um cartaz, livreto ou fôlder colaborativo. A revisão final verifica clareza, variedade e os critérios do manual, e cada equipe explica suas escolhas.</w:t>
+      </w:r>
+    </w:p>
+    <w:p>
+      <w:pPr>
+        <w:pStyle w:val="Compact"/>
+        <w:numPr>
+          <w:ilvl w:val="0"/>
+          <w:numId w:val="1003"/>
+        </w:numPr>
+      </w:pPr>
+      <w:r>
+        <w:t xml:space="preserve">Classificação:</w:t>
+      </w:r>
+      <w:r>
+        <w:t xml:space="preserve"> </w:t>
+      </w:r>
+      <w:r>
+        <w:rPr>
+          <w:b/>
+          <w:bCs/>
+        </w:rPr>
+        <w:t xml:space="preserve">B — Produção prática</w:t>
+      </w:r>
+      <w:r>
+        <w:t xml:space="preserve">. A atividade é uma produção visual coletiva; não há montagem, mecanismo, robótica, programação ou teste tecnológico central.</w:t>
+      </w:r>
+    </w:p>
+    <w:p>
+      <w:pPr>
+        <w:pStyle w:val="Compact"/>
+        <w:numPr>
+          <w:ilvl w:val="0"/>
+          <w:numId w:val="1003"/>
+        </w:numPr>
+      </w:pPr>
+      <w:r>
+        <w:t xml:space="preserve">Duração: 5ºB tem 100 min conforme a grade; a distribuição abaixo é adaptada, pois o manual não fixa duração.</w:t>
       </w:r>
     </w:p>
     <w:tbl>
       <w:tblPr>
         <w:tblStyle w:val="Table"/>
-        <w:tblW w:type="pct" w:w="5000"/>
-        <w:tblLayout w:type="fixed"/>
+        <w:tblW w:type="auto" w:w="0"/>
         <w:tblLook w:firstRow="1" w:lastRow="0" w:firstColumn="0" w:lastColumn="0" w:noHBand="0" w:noVBand="0" w:val="0020"/>
       </w:tblPr>
       <w:tblGrid>
-        <w:gridCol w:w="2376"/>
-        <w:gridCol w:w="3168"/>
-        <w:gridCol w:w="2376"/>
+        <w:gridCol w:w="2640"/>
+        <w:gridCol w:w="2640"/>
+        <w:gridCol w:w="2640"/>
       </w:tblGrid>
       <w:tr>
         <w:trPr>
@@ -1278,7 +1370,7 @@
               <w:pStyle w:val="Compact"/>
             </w:pPr>
             <w:r>
-              <w:t xml:space="preserve">Retomada</w:t>
+              <w:t xml:space="preserve">Desafio e conversa breve</w:t>
             </w:r>
           </w:p>
         </w:tc>
@@ -1301,7 +1393,7 @@
               <w:pStyle w:val="Compact"/>
             </w:pPr>
             <w:r>
-              <w:t xml:space="preserve">Relembrar o modelo respiratório e a troca de gases.</w:t>
+              <w:t xml:space="preserve">Apresentar a situação fictícia da cantina e levantar o que um cardápio informa.</w:t>
             </w:r>
           </w:p>
         </w:tc>
@@ -1314,7 +1406,7 @@
               <w:pStyle w:val="Compact"/>
             </w:pPr>
             <w:r>
-              <w:t xml:space="preserve">Desafio</w:t>
+              <w:t xml:space="preserve">Planejar</w:t>
             </w:r>
           </w:p>
         </w:tc>
@@ -1326,18 +1418,18 @@
               <w:jc w:val="right"/>
             </w:pPr>
             <w:r>
-              <w:t xml:space="preserve">50 min</w:t>
-            </w:r>
-          </w:p>
-        </w:tc>
-        <w:tc>
-          <w:tcPr/>
-          <w:p>
-            <w:pPr>
-              <w:pStyle w:val="Compact"/>
-            </w:pPr>
-            <w:r>
-              <w:t xml:space="preserve">Realizar o Momento do desafio de Bem-estar em equipes.</w:t>
+              <w:t xml:space="preserve">15 min</w:t>
+            </w:r>
+          </w:p>
+        </w:tc>
+        <w:tc>
+          <w:tcPr/>
+          <w:p>
+            <w:pPr>
+              <w:pStyle w:val="Compact"/>
+            </w:pPr>
+            <w:r>
+              <w:t xml:space="preserve">Definir a estrutura do cardápio semanal e repartir os dias entre equipes.</w:t>
             </w:r>
           </w:p>
         </w:tc>
@@ -1350,7 +1442,7 @@
               <w:pStyle w:val="Compact"/>
             </w:pPr>
             <w:r>
-              <w:t xml:space="preserve">Socializar</w:t>
+              <w:t xml:space="preserve">Construir</w:t>
             </w:r>
           </w:p>
         </w:tc>
@@ -1362,18 +1454,18 @@
               <w:jc w:val="right"/>
             </w:pPr>
             <w:r>
-              <w:t xml:space="preserve">25 min</w:t>
-            </w:r>
-          </w:p>
-        </w:tc>
-        <w:tc>
-          <w:tcPr/>
-          <w:p>
-            <w:pPr>
-              <w:pStyle w:val="Compact"/>
-            </w:pPr>
-            <w:r>
-              <w:t xml:space="preserve">Apresentar evidências e estratégias encontradas.</w:t>
+              <w:t xml:space="preserve">50 min</w:t>
+            </w:r>
+          </w:p>
+        </w:tc>
+        <w:tc>
+          <w:tcPr/>
+          <w:p>
+            <w:pPr>
+              <w:pStyle w:val="Compact"/>
+            </w:pPr>
+            <w:r>
+              <w:t xml:space="preserve">Desenhar ou fazer colagens para criar as partes do cardápio e reuni-las em um produto coletivo.</w:t>
             </w:r>
           </w:p>
         </w:tc>
@@ -1386,7 +1478,7 @@
               <w:pStyle w:val="Compact"/>
             </w:pPr>
             <w:r>
-              <w:t xml:space="preserve">Registro</w:t>
+              <w:t xml:space="preserve">Testar e ajustar</w:t>
             </w:r>
           </w:p>
         </w:tc>
@@ -1409,30 +1501,421 @@
               <w:pStyle w:val="Compact"/>
             </w:pPr>
             <w:r>
-              <w:t xml:space="preserve">Registrar uma prática de bem-estar relacionada à respiração.</w:t>
+              <w:t xml:space="preserve">Ler o produto completo; revisar legibilidade, variedade, moderação e equilíbrio conforme o manual; ajustar o que não estiver claro.</w:t>
+            </w:r>
+          </w:p>
+        </w:tc>
+      </w:tr>
+      <w:tr>
+        <w:tc>
+          <w:tcPr/>
+          <w:p>
+            <w:pPr>
+              <w:pStyle w:val="Compact"/>
+            </w:pPr>
+            <w:r>
+              <w:t xml:space="preserve">Apresentar</w:t>
+            </w:r>
+          </w:p>
+        </w:tc>
+        <w:tc>
+          <w:tcPr/>
+          <w:p>
+            <w:pPr>
+              <w:pStyle w:val="Compact"/>
+              <w:jc w:val="right"/>
+            </w:pPr>
+            <w:r>
+              <w:t xml:space="preserve">10 min</w:t>
+            </w:r>
+          </w:p>
+        </w:tc>
+        <w:tc>
+          <w:tcPr/>
+          <w:p>
+            <w:pPr>
+              <w:pStyle w:val="Compact"/>
+            </w:pPr>
+            <w:r>
+              <w:t xml:space="preserve">Explicar as escolhas e como o cardápio pode apoiar o bem-estar nutricional.</w:t>
             </w:r>
           </w:p>
         </w:tc>
       </w:tr>
     </w:tbl>
-    <w:bookmarkEnd w:id="13"/>
-    <w:bookmarkEnd w:id="14"/>
+    <w:bookmarkStart w:id="15" w:name="resumo-do-encontro-2"/>
+    <w:p>
+      <w:pPr>
+        <w:pStyle w:val="Heading4"/>
+      </w:pPr>
+      <w:r>
+        <w:t xml:space="preserve">Resumo do Encontro</w:t>
+      </w:r>
+    </w:p>
+    <w:p>
+      <w:pPr>
+        <w:pStyle w:val="BlockText"/>
+      </w:pPr>
+      <w:r>
+        <w:rPr>
+          <w:b/>
+          <w:bCs/>
+        </w:rPr>
+        <w:t xml:space="preserve">Mensagem de rotina para as famílias:</w:t>
+      </w:r>
+      <w:r>
+        <w:t xml:space="preserve"> </w:t>
+      </w:r>
+      <w:r>
+        <w:t xml:space="preserve">A turma planejou um cardápio semanal equilibrado para uma cantina fictícia. As equipes criaram partes do cardápio, reuniram o trabalho em um produto coletivo, revisaram as escolhas e explicaram como consideraram variedade, moderação e equilíbrio.</w:t>
+      </w:r>
+    </w:p>
     <w:bookmarkEnd w:id="15"/>
+    <w:bookmarkEnd w:id="16"/>
+    <w:bookmarkStart w:id="18" w:name="X996e1066b3616cf211d71b7d45bd45ee567bfc7"/>
+    <w:p>
+      <w:pPr>
+        <w:pStyle w:val="Heading3"/>
+      </w:pPr>
+      <w:r>
+        <w:t xml:space="preserve">5ºC — Código Morse (30/09, 14:3515:45)</w:t>
+      </w:r>
+    </w:p>
+    <w:p>
+      <w:pPr>
+        <w:pStyle w:val="Compact"/>
+        <w:numPr>
+          <w:ilvl w:val="0"/>
+          <w:numId w:val="1004"/>
+        </w:numPr>
+      </w:pPr>
+      <w:r>
+        <w:t xml:space="preserve">Objetivo: construir e programar, em equipe, um protótipo de telégrafo digital para enviar e receber mensagens em código Morse.</w:t>
+      </w:r>
+    </w:p>
+    <w:p>
+      <w:pPr>
+        <w:pStyle w:val="Compact"/>
+        <w:numPr>
+          <w:ilvl w:val="0"/>
+          <w:numId w:val="1004"/>
+        </w:numPr>
+      </w:pPr>
+      <w:r>
+        <w:t xml:space="preserve">Referências: Manual do Educador, p. 240; guia/material do estudante, pp. 4–14.</w:t>
+      </w:r>
+    </w:p>
+    <w:p>
+      <w:pPr>
+        <w:pStyle w:val="Compact"/>
+        <w:numPr>
+          <w:ilvl w:val="0"/>
+          <w:numId w:val="1004"/>
+        </w:numPr>
+      </w:pPr>
+      <w:r>
+        <w:t xml:space="preserve">Materiais: Conjunto de Blocos e Mecanismos Motorizados, VinciBot, computador ou tablet e guia da montagem.</w:t>
+      </w:r>
+    </w:p>
+    <w:p>
+      <w:pPr>
+        <w:pStyle w:val="Compact"/>
+        <w:numPr>
+          <w:ilvl w:val="0"/>
+          <w:numId w:val="1004"/>
+        </w:numPr>
+      </w:pPr>
+      <w:r>
+        <w:t xml:space="preserve">Classificação:</w:t>
+      </w:r>
+      <w:r>
+        <w:t xml:space="preserve"> </w:t>
+      </w:r>
+      <w:r>
+        <w:rPr>
+          <w:b/>
+          <w:bCs/>
+        </w:rPr>
+        <w:t xml:space="preserve">A — Experiência maker / tecnológica central</w:t>
+      </w:r>
+      <w:r>
+        <w:t xml:space="preserve">. O núcleo combina montagem do protótipo, programação, envio/recebimento de mensagens e teste entre equipes.</w:t>
+      </w:r>
+    </w:p>
+    <w:p>
+      <w:pPr>
+        <w:pStyle w:val="Compact"/>
+        <w:numPr>
+          <w:ilvl w:val="0"/>
+          <w:numId w:val="1004"/>
+        </w:numPr>
+      </w:pPr>
+      <w:r>
+        <w:t xml:space="preserve">Duração: 70 min conforme a grade.</w:t>
+      </w:r>
+    </w:p>
+    <w:tbl>
+      <w:tblPr>
+        <w:tblStyle w:val="Table"/>
+        <w:tblW w:type="auto" w:w="0"/>
+        <w:tblLook w:firstRow="1" w:lastRow="0" w:firstColumn="0" w:lastColumn="0" w:noHBand="0" w:noVBand="0" w:val="0020"/>
+      </w:tblPr>
+      <w:tblGrid>
+        <w:gridCol w:w="2640"/>
+        <w:gridCol w:w="2640"/>
+        <w:gridCol w:w="2640"/>
+      </w:tblGrid>
+      <w:tr>
+        <w:trPr>
+          <w:tblHeader w:val="on"/>
+        </w:trPr>
+        <w:tc>
+          <w:tcPr/>
+          <w:p>
+            <w:pPr>
+              <w:pStyle w:val="Compact"/>
+            </w:pPr>
+            <w:r>
+              <w:t xml:space="preserve">Etapa</w:t>
+            </w:r>
+          </w:p>
+        </w:tc>
+        <w:tc>
+          <w:tcPr/>
+          <w:p>
+            <w:pPr>
+              <w:pStyle w:val="Compact"/>
+              <w:jc w:val="right"/>
+            </w:pPr>
+            <w:r>
+              <w:t xml:space="preserve">Tempo</w:t>
+            </w:r>
+          </w:p>
+        </w:tc>
+        <w:tc>
+          <w:tcPr/>
+          <w:p>
+            <w:pPr>
+              <w:pStyle w:val="Compact"/>
+            </w:pPr>
+            <w:r>
+              <w:t xml:space="preserve">Condução</w:t>
+            </w:r>
+          </w:p>
+        </w:tc>
+      </w:tr>
+      <w:tr>
+        <w:tc>
+          <w:tcPr/>
+          <w:p>
+            <w:pPr>
+              <w:pStyle w:val="Compact"/>
+            </w:pPr>
+            <w:r>
+              <w:t xml:space="preserve">Retomada</w:t>
+            </w:r>
+          </w:p>
+        </w:tc>
+        <w:tc>
+          <w:tcPr/>
+          <w:p>
+            <w:pPr>
+              <w:pStyle w:val="Compact"/>
+              <w:jc w:val="right"/>
+            </w:pPr>
+            <w:r>
+              <w:t xml:space="preserve">10 min</w:t>
+            </w:r>
+          </w:p>
+        </w:tc>
+        <w:tc>
+          <w:tcPr/>
+          <w:p>
+            <w:pPr>
+              <w:pStyle w:val="Compact"/>
+            </w:pPr>
+            <w:r>
+              <w:t xml:space="preserve">Retomar o cardápio de Bem-estar realizado em 23/09 e apresentar a passagem para os meios de comunicação.</w:t>
+            </w:r>
+          </w:p>
+        </w:tc>
+      </w:tr>
+      <w:tr>
+        <w:tc>
+          <w:tcPr/>
+          <w:p>
+            <w:pPr>
+              <w:pStyle w:val="Compact"/>
+            </w:pPr>
+            <w:r>
+              <w:t xml:space="preserve">Investigar</w:t>
+            </w:r>
+          </w:p>
+        </w:tc>
+        <w:tc>
+          <w:tcPr/>
+          <w:p>
+            <w:pPr>
+              <w:pStyle w:val="Compact"/>
+              <w:jc w:val="right"/>
+            </w:pPr>
+            <w:r>
+              <w:t xml:space="preserve">10 min</w:t>
+            </w:r>
+          </w:p>
+        </w:tc>
+        <w:tc>
+          <w:tcPr/>
+          <w:p>
+            <w:pPr>
+              <w:pStyle w:val="Compact"/>
+            </w:pPr>
+            <w:r>
+              <w:t xml:space="preserve">Explorar telégrafo, pontos e traços do código Morse.</w:t>
+            </w:r>
+          </w:p>
+        </w:tc>
+      </w:tr>
+      <w:tr>
+        <w:tc>
+          <w:tcPr/>
+          <w:p>
+            <w:pPr>
+              <w:pStyle w:val="Compact"/>
+            </w:pPr>
+            <w:r>
+              <w:t xml:space="preserve">Montar e programar</w:t>
+            </w:r>
+          </w:p>
+        </w:tc>
+        <w:tc>
+          <w:tcPr/>
+          <w:p>
+            <w:pPr>
+              <w:pStyle w:val="Compact"/>
+              <w:jc w:val="right"/>
+            </w:pPr>
+            <w:r>
+              <w:t xml:space="preserve">30 min</w:t>
+            </w:r>
+          </w:p>
+        </w:tc>
+        <w:tc>
+          <w:tcPr/>
+          <w:p>
+            <w:pPr>
+              <w:pStyle w:val="Compact"/>
+            </w:pPr>
+            <w:r>
+              <w:t xml:space="preserve">Construir o protótipo e programar os sinais de ponto e traço no VinciBot.</w:t>
+            </w:r>
+          </w:p>
+        </w:tc>
+      </w:tr>
+      <w:tr>
+        <w:tc>
+          <w:tcPr/>
+          <w:p>
+            <w:pPr>
+              <w:pStyle w:val="Compact"/>
+            </w:pPr>
+            <w:r>
+              <w:t xml:space="preserve">Testar e ajustar</w:t>
+            </w:r>
+          </w:p>
+        </w:tc>
+        <w:tc>
+          <w:tcPr/>
+          <w:p>
+            <w:pPr>
+              <w:pStyle w:val="Compact"/>
+              <w:jc w:val="right"/>
+            </w:pPr>
+            <w:r>
+              <w:t xml:space="preserve">15 min</w:t>
+            </w:r>
+          </w:p>
+        </w:tc>
+        <w:tc>
+          <w:tcPr/>
+          <w:p>
+            <w:pPr>
+              <w:pStyle w:val="Compact"/>
+            </w:pPr>
+            <w:r>
+              <w:t xml:space="preserve">Trocar mensagens entre equipes, identificar falhas de transmissão ou decodificação e ajustar a programação.</w:t>
+            </w:r>
+          </w:p>
+        </w:tc>
+      </w:tr>
+      <w:tr>
+        <w:tc>
+          <w:tcPr/>
+          <w:p>
+            <w:pPr>
+              <w:pStyle w:val="Compact"/>
+            </w:pPr>
+            <w:r>
+              <w:t xml:space="preserve">Fechar</w:t>
+            </w:r>
+          </w:p>
+        </w:tc>
+        <w:tc>
+          <w:tcPr/>
+          <w:p>
+            <w:pPr>
+              <w:pStyle w:val="Compact"/>
+              <w:jc w:val="right"/>
+            </w:pPr>
+            <w:r>
+              <w:t xml:space="preserve">5 min</w:t>
+            </w:r>
+          </w:p>
+        </w:tc>
+        <w:tc>
+          <w:tcPr/>
+          <w:p>
+            <w:pPr>
+              <w:pStyle w:val="Compact"/>
+            </w:pPr>
+            <w:r>
+              <w:t xml:space="preserve">Registrar o ajuste que tornou a comunicação mais confiável.</w:t>
+            </w:r>
+          </w:p>
+        </w:tc>
+      </w:tr>
+    </w:tbl>
+    <w:bookmarkStart w:id="17" w:name="resumo-do-encontro-3"/>
     <w:p>
       <w:pPr>
         <w:pStyle w:val="Heading4"/>
       </w:pPr>
       <w:r>
-        <w:t>Resumo do Encontro</w:t>
-      </w:r>
-    </w:p>
-    <w:p>
-      <w:pPr/>
-      <w:r>
-        <w:t>Mensagem de rotina para as famílias: Hoje a turma participou de um desafio de bem-estar a partir do que estudou sobre o sistema respiratório. As crianças analisaram situações do cotidiano, relacionaram respiração, movimento e cuidados com o corpo e compartilharam suas conclusões. Foi um momento de investigar como os conhecimentos científicos também ajudam nas escolhas do dia a dia.</w:t>
-      </w:r>
-    </w:p>
-    <w:p/>
+        <w:t xml:space="preserve">Resumo do Encontro</w:t>
+      </w:r>
+    </w:p>
+    <w:p>
+      <w:pPr>
+        <w:pStyle w:val="BlockText"/>
+      </w:pPr>
+      <w:r>
+        <w:rPr>
+          <w:b/>
+          <w:bCs/>
+        </w:rPr>
+        <w:t xml:space="preserve">Mensagem de rotina para as famílias:</w:t>
+      </w:r>
+      <w:r>
+        <w:t xml:space="preserve"> </w:t>
+      </w:r>
+      <w:r>
+        <w:t xml:space="preserve">Hoje a turma construiu e programou um protótipo de telégrafo digital com o VinciBot. As equipes enviaram e receberam mensagens em código Morse, testaram a comunicação e ajustaram a programação quando os sinais não eram compreendidos.</w:t>
+      </w:r>
+    </w:p>
+    <w:bookmarkEnd w:id="17"/>
+    <w:bookmarkEnd w:id="18"/>
+    <w:bookmarkEnd w:id="19"/>
+    <w:bookmarkEnd w:id="20"/>
     <w:sectPr>
       <w:footnotePr>
         <w:numRestart w:val="eachSect"/>
@@ -1656,6 +2139,9 @@
     <w:abstractNumId w:val="991"/>
   </w:num>
   <w:num w:numId="1003">
+    <w:abstractNumId w:val="991"/>
+  </w:num>
+  <w:num w:numId="1004">
     <w:abstractNumId w:val="991"/>
   </w:num>
 </w:numbering>
@@ -2317,7 +2803,7 @@
       <w:color w:themeColor="accent1" w:themeShade="BF" w:val="365F91"/>
     </w:rPr>
   </w:style>
-  <w:style w:type="paragraph" w:customStyle="1" w:styleId="SourceCode">
+  <w:style w:customStyle="1" w:styleId="SourceCode" w:type="paragraph">
     <w:name w:val="Source Code"/>
     <w:basedOn w:val="Normal"/>
     <w:link w:val="VerbatimChar"/>
@@ -2325,7 +2811,7 @@
       <w:wordWrap w:val="off"/>
     </w:pPr>
   </w:style>
-  <w:style w:type="character" w:customStyle="1" w:styleId="KeywordTok">
+  <w:style w:customStyle="1" w:styleId="KeywordTok" w:type="character">
     <w:name w:val="KeywordTok"/>
     <w:basedOn w:val="VerbatimChar"/>
     <w:rPr>
@@ -2333,77 +2819,77 @@
       <w:color w:val="007020"/>
     </w:rPr>
   </w:style>
-  <w:style w:type="character" w:customStyle="1" w:styleId="DataTypeTok">
+  <w:style w:customStyle="1" w:styleId="DataTypeTok" w:type="character">
     <w:name w:val="DataTypeTok"/>
     <w:basedOn w:val="VerbatimChar"/>
     <w:rPr>
       <w:color w:val="902000"/>
     </w:rPr>
   </w:style>
-  <w:style w:type="character" w:customStyle="1" w:styleId="DecValTok">
+  <w:style w:customStyle="1" w:styleId="DecValTok" w:type="character">
     <w:name w:val="DecValTok"/>
     <w:basedOn w:val="VerbatimChar"/>
     <w:rPr>
       <w:color w:val="40a070"/>
     </w:rPr>
   </w:style>
-  <w:style w:type="character" w:customStyle="1" w:styleId="BaseNTok">
+  <w:style w:customStyle="1" w:styleId="BaseNTok" w:type="character">
     <w:name w:val="BaseNTok"/>
     <w:basedOn w:val="VerbatimChar"/>
     <w:rPr>
       <w:color w:val="40a070"/>
     </w:rPr>
   </w:style>
-  <w:style w:type="character" w:customStyle="1" w:styleId="FloatTok">
+  <w:style w:customStyle="1" w:styleId="FloatTok" w:type="character">
     <w:name w:val="FloatTok"/>
     <w:basedOn w:val="VerbatimChar"/>
     <w:rPr>
       <w:color w:val="40a070"/>
     </w:rPr>
   </w:style>
-  <w:style w:type="character" w:customStyle="1" w:styleId="ConstantTok">
+  <w:style w:customStyle="1" w:styleId="ConstantTok" w:type="character">
     <w:name w:val="ConstantTok"/>
     <w:basedOn w:val="VerbatimChar"/>
     <w:rPr>
       <w:color w:val="880000"/>
     </w:rPr>
   </w:style>
-  <w:style w:type="character" w:customStyle="1" w:styleId="CharTok">
+  <w:style w:customStyle="1" w:styleId="CharTok" w:type="character">
     <w:name w:val="CharTok"/>
     <w:basedOn w:val="VerbatimChar"/>
     <w:rPr>
       <w:color w:val="4070a0"/>
     </w:rPr>
   </w:style>
-  <w:style w:type="character" w:customStyle="1" w:styleId="SpecialCharTok">
+  <w:style w:customStyle="1" w:styleId="SpecialCharTok" w:type="character">
     <w:name w:val="SpecialCharTok"/>
     <w:basedOn w:val="VerbatimChar"/>
     <w:rPr>
       <w:color w:val="4070a0"/>
     </w:rPr>
   </w:style>
-  <w:style w:type="character" w:customStyle="1" w:styleId="StringTok">
+  <w:style w:customStyle="1" w:styleId="StringTok" w:type="character">
     <w:name w:val="StringTok"/>
     <w:basedOn w:val="VerbatimChar"/>
     <w:rPr>
       <w:color w:val="4070a0"/>
     </w:rPr>
   </w:style>
-  <w:style w:type="character" w:customStyle="1" w:styleId="VerbatimStringTok">
+  <w:style w:customStyle="1" w:styleId="VerbatimStringTok" w:type="character">
     <w:name w:val="VerbatimStringTok"/>
     <w:basedOn w:val="VerbatimChar"/>
     <w:rPr>
       <w:color w:val="4070a0"/>
     </w:rPr>
   </w:style>
-  <w:style w:type="character" w:customStyle="1" w:styleId="SpecialStringTok">
+  <w:style w:customStyle="1" w:styleId="SpecialStringTok" w:type="character">
     <w:name w:val="SpecialStringTok"/>
     <w:basedOn w:val="VerbatimChar"/>
     <w:rPr>
       <w:color w:val="bb6688"/>
     </w:rPr>
   </w:style>
-  <w:style w:type="character" w:customStyle="1" w:styleId="ImportTok">
+  <w:style w:customStyle="1" w:styleId="ImportTok" w:type="character">
     <w:name w:val="ImportTok"/>
     <w:basedOn w:val="VerbatimChar"/>
     <w:rPr>
@@ -2411,7 +2897,7 @@
       <w:color w:val="008000"/>
     </w:rPr>
   </w:style>
-  <w:style w:type="character" w:customStyle="1" w:styleId="CommentTok">
+  <w:style w:customStyle="1" w:styleId="CommentTok" w:type="character">
     <w:name w:val="CommentTok"/>
     <w:basedOn w:val="VerbatimChar"/>
     <w:rPr>
@@ -2419,7 +2905,7 @@
       <w:color w:val="60a0b0"/>
     </w:rPr>
   </w:style>
-  <w:style w:type="character" w:customStyle="1" w:styleId="DocumentationTok">
+  <w:style w:customStyle="1" w:styleId="DocumentationTok" w:type="character">
     <w:name w:val="DocumentationTok"/>
     <w:basedOn w:val="VerbatimChar"/>
     <w:rPr>
@@ -2427,7 +2913,7 @@
       <w:color w:val="ba2121"/>
     </w:rPr>
   </w:style>
-  <w:style w:type="character" w:customStyle="1" w:styleId="AnnotationTok">
+  <w:style w:customStyle="1" w:styleId="AnnotationTok" w:type="character">
     <w:name w:val="AnnotationTok"/>
     <w:basedOn w:val="VerbatimChar"/>
     <w:rPr>
@@ -2436,7 +2922,7 @@
       <w:color w:val="60a0b0"/>
     </w:rPr>
   </w:style>
-  <w:style w:type="character" w:customStyle="1" w:styleId="CommentVarTok">
+  <w:style w:customStyle="1" w:styleId="CommentVarTok" w:type="character">
     <w:name w:val="CommentVarTok"/>
     <w:basedOn w:val="VerbatimChar"/>
     <w:rPr>
@@ -2445,28 +2931,28 @@
       <w:color w:val="60a0b0"/>
     </w:rPr>
   </w:style>
-  <w:style w:type="character" w:customStyle="1" w:styleId="OtherTok">
+  <w:style w:customStyle="1" w:styleId="OtherTok" w:type="character">
     <w:name w:val="OtherTok"/>
     <w:basedOn w:val="VerbatimChar"/>
     <w:rPr>
       <w:color w:val="007020"/>
     </w:rPr>
   </w:style>
-  <w:style w:type="character" w:customStyle="1" w:styleId="FunctionTok">
+  <w:style w:customStyle="1" w:styleId="FunctionTok" w:type="character">
     <w:name w:val="FunctionTok"/>
     <w:basedOn w:val="VerbatimChar"/>
     <w:rPr>
       <w:color w:val="06287e"/>
     </w:rPr>
   </w:style>
-  <w:style w:type="character" w:customStyle="1" w:styleId="VariableTok">
+  <w:style w:customStyle="1" w:styleId="VariableTok" w:type="character">
     <w:name w:val="VariableTok"/>
     <w:basedOn w:val="VerbatimChar"/>
     <w:rPr>
       <w:color w:val="19177c"/>
     </w:rPr>
   </w:style>
-  <w:style w:type="character" w:customStyle="1" w:styleId="ControlFlowTok">
+  <w:style w:customStyle="1" w:styleId="ControlFlowTok" w:type="character">
     <w:name w:val="ControlFlowTok"/>
     <w:basedOn w:val="VerbatimChar"/>
     <w:rPr>
@@ -2474,45 +2960,45 @@
       <w:color w:val="007020"/>
     </w:rPr>
   </w:style>
-  <w:style w:type="character" w:customStyle="1" w:styleId="OperatorTok">
+  <w:style w:customStyle="1" w:styleId="OperatorTok" w:type="character">
     <w:name w:val="OperatorTok"/>
     <w:basedOn w:val="VerbatimChar"/>
     <w:rPr>
       <w:color w:val="666666"/>
     </w:rPr>
   </w:style>
-  <w:style w:type="character" w:customStyle="1" w:styleId="BuiltInTok">
+  <w:style w:customStyle="1" w:styleId="BuiltInTok" w:type="character">
     <w:name w:val="BuiltInTok"/>
     <w:basedOn w:val="VerbatimChar"/>
     <w:rPr>
       <w:color w:val="008000"/>
     </w:rPr>
   </w:style>
-  <w:style w:type="character" w:customStyle="1" w:styleId="ExtensionTok">
+  <w:style w:customStyle="1" w:styleId="ExtensionTok" w:type="character">
     <w:name w:val="ExtensionTok"/>
     <w:basedOn w:val="VerbatimChar"/>
     <w:rPr/>
   </w:style>
-  <w:style w:type="character" w:customStyle="1" w:styleId="PreprocessorTok">
+  <w:style w:customStyle="1" w:styleId="PreprocessorTok" w:type="character">
     <w:name w:val="PreprocessorTok"/>
     <w:basedOn w:val="VerbatimChar"/>
     <w:rPr>
       <w:color w:val="bc7a00"/>
     </w:rPr>
   </w:style>
-  <w:style w:type="character" w:customStyle="1" w:styleId="AttributeTok">
+  <w:style w:customStyle="1" w:styleId="AttributeTok" w:type="character">
     <w:name w:val="AttributeTok"/>
     <w:basedOn w:val="VerbatimChar"/>
     <w:rPr>
       <w:color w:val="7d9029"/>
     </w:rPr>
   </w:style>
-  <w:style w:type="character" w:customStyle="1" w:styleId="RegionMarkerTok">
+  <w:style w:customStyle="1" w:styleId="RegionMarkerTok" w:type="character">
     <w:name w:val="RegionMarkerTok"/>
     <w:basedOn w:val="VerbatimChar"/>
     <w:rPr/>
   </w:style>
-  <w:style w:type="character" w:customStyle="1" w:styleId="InformationTok">
+  <w:style w:customStyle="1" w:styleId="InformationTok" w:type="character">
     <w:name w:val="InformationTok"/>
     <w:basedOn w:val="VerbatimChar"/>
     <w:rPr>
@@ -2521,7 +3007,7 @@
       <w:color w:val="60a0b0"/>
     </w:rPr>
   </w:style>
-  <w:style w:type="character" w:customStyle="1" w:styleId="WarningTok">
+  <w:style w:customStyle="1" w:styleId="WarningTok" w:type="character">
     <w:name w:val="WarningTok"/>
     <w:basedOn w:val="VerbatimChar"/>
     <w:rPr>
@@ -2530,7 +3016,7 @@
       <w:color w:val="60a0b0"/>
     </w:rPr>
   </w:style>
-  <w:style w:type="character" w:customStyle="1" w:styleId="AlertTok">
+  <w:style w:customStyle="1" w:styleId="AlertTok" w:type="character">
     <w:name w:val="AlertTok"/>
     <w:basedOn w:val="VerbatimChar"/>
     <w:rPr>
@@ -2538,7 +3024,7 @@
       <w:color w:val="ff0000"/>
     </w:rPr>
   </w:style>
-  <w:style w:type="character" w:customStyle="1" w:styleId="ErrorTok">
+  <w:style w:customStyle="1" w:styleId="ErrorTok" w:type="character">
     <w:name w:val="ErrorTok"/>
     <w:basedOn w:val="VerbatimChar"/>
     <w:rPr>
@@ -2546,7 +3032,7 @@
       <w:color w:val="ff0000"/>
     </w:rPr>
   </w:style>
-  <w:style w:type="character" w:customStyle="1" w:styleId="NormalTok">
+  <w:style w:customStyle="1" w:styleId="NormalTok" w:type="character">
     <w:name w:val="NormalTok"/>
     <w:basedOn w:val="VerbatimChar"/>
     <w:rPr/>

</xml_diff>